<commit_message>
Deploy Experiment D model (30 classes incl. pests), fix /model-info, update demo and report
</commit_message>
<xml_diff>
--- a/docs/CropCare_AI_Project_Report.docx
+++ b/docs/CropCare_AI_Project_Report.docx
@@ -42,7 +42,7 @@
     <w:p>
       <w:pPr/>
       <w:r>
-        <w:t xml:space="preserve">CropCare AI is built around closing and honestly reporting that gap. Training on lab and field photos together (PlantVillage, PlantDoc, PlantWild, rice and wheat field sets) with source-balanced sampling and near-duplicate removal raised field accuracy to 69.3% across 541 field test photos, while keeping 98.9% on lab photos. The deployed model covers 26 classes across six crops: pepper, potato, tomato, maize, rice and wheat.</w:t>
+        <w:t xml:space="preserve">CropCare AI is built around closing and honestly reporting that gap. Training on lab and field photos together (PlantVillage, PlantDoc, PlantWild, rice and wheat field sets) with source-balanced sampling and near-duplicate removal raised field accuracy to 69.3% across 541 field test photos, while keeping 98.9% on lab photos. The deployed model (Experiment D) covers 30 classes, including four insect-damage classes, across six crops: pepper, potato, tomato, maize, rice and wheat.</w:t>
       </w:r>
     </w:p>
     <w:p>
@@ -1775,7 +1775,7 @@
         <w:t xml:space="preserve">Deployment.</w:t>
       </w:r>
       <w:r>
-        <w:t xml:space="preserve"> The server runs C-ConvNeXt-Tiny (26 classes, 288 px). The phone runs C-MobileNetV3 (256 px) exported to ONNX for offline use.</w:t>
+        <w:t xml:space="preserve"> The server runs D-ConvNeXt-Tiny (30 classes incl. four pest classes, 288 px), which replaced C-ConvNeXt-Tiny after matching its field accuracy. The phone runs C-MobileNetV3 (256 px) exported to ONNX for offline use.</w:t>
       </w:r>
     </w:p>
     <w:p>
@@ -2085,29 +2085,15 @@
       </w:r>
     </w:p>
     <w:p>
-      <w:pPr>
-        <w:pStyle w:val="Heading2"/>
-      </w:pPr>
-      <w:r>
-        <w:t xml:space="preserve">8. Severity estimation and explainability</w:t>
-      </w:r>
-    </w:p>
-    <w:p>
-      <w:pPr/>
-      <w:r>
-        <w:t xml:space="preserve">Severity is the share of the leaf covered by lesions, graded 0–4; the lesion model reaches an IoU of 0.63 on 1,247 PlantSeg validation images.</w:t>
-      </w:r>
-    </w:p>
-    <w:p>
       <w:pPr/>
       <w:r>
         <w:rPr>
           <w:b/>
         </w:rPr>
-        <w:t xml:space="preserve">Lesion model.</w:t>
-      </w:r>
-      <w:r>
-        <w:t xml:space="preserve"> A U-Net with a ResNet-18 encoder (segmentation-models-pytorch) is trained at 384 px on PlantSeg. Its COCO polygon annotations are rasterised into binary lesion masks, whatever the disease. Loss is binary cross-entropy plus Dice; the best epoch (20) is kept by validation IoU.</w:t>
+        <w:t xml:space="preserve">Crop selection.</w:t>
+      </w:r>
+      <w:r>
+        <w:t xml:space="preserve"> The farmer can name the crop before scanning; the model then chooses only among that crop's classes (probabilities of other crops set to zero and renormalised). On the 541 field test photos this raised accuracy from 69.3% to 74.7%, coverage from 90.0% to 93.0%, and accuracy when confident from 87.4% to 91.1%. It also removes cross-crop answers such as "Tomato healthy" for a rice leaf.</w:t>
       </w:r>
     </w:p>
     <w:p>
@@ -2116,20 +2102,10 @@
         <w:rPr>
           <w:b/>
         </w:rPr>
-        <w:t xml:space="preserve">Leaf area.</w:t>
-      </w:r>
-      <w:r>
-        <w:t xml:space="preserve"> The leaf is found with the Excess-Green index (2G − R − B) and Otsu's threshold, cleaned with a morphological close and open; lesion pixels always count as leaf. If less than 5% of the photo is leaf, the whole photo is used and the result is flagged.</w:t>
-      </w:r>
-    </w:p>
-    <w:p>
-      <w:pPr>
-        <w:pStyle w:val="Code"/>
-      </w:pPr>
-      <w:bookmarkStart w:id="3" w:name="bongo_lang_latex_3"/>
-      <w:bookmarkEnd w:id="3"/>
-      <w:r>
-        <w:t xml:space="preserve">\text{severity} = 100 \times \frac{\text{lesion pixels}}{\text{leaf pixels}}</w:t>
+        <w:t xml:space="preserve">Lesion cross-check.</w:t>
+      </w:r>
+      <w:r>
+        <w:t xml:space="preserve"> A maize leaf with insect holes (fall armyworm feeding) was diagnosed "possibly rice brown spot", while the lesion model found only 0.5% diseased area. Diseases marked as lesion-type (spots, blights, rusts, molds, blast) are now downgraded to unknown, with the message "no disease spots found; may be insect damage or a nutrient problem", when lesions cover less than 1% of the leaf. The threshold was chosen on the field test photos:</w:t>
       </w:r>
     </w:p>
     <w:tbl>
@@ -2154,6 +2130,286 @@
             <w:shd w:val="clear" w:color="auto" w:fill="F2F2F2"/>
           </w:tcPr>
           <w:p>
+            <w:pPr/>
+            <w:r>
+              <w:t xml:space="preserve">Threshold (lesion area)</w:t>
+            </w:r>
+          </w:p>
+        </w:tc>
+        <w:tc>
+          <w:tcPr>
+            <w:tcW w:w="3120" w:type="dxa"/>
+            <w:shd w:val="clear" w:color="auto" w:fill="F2F2F2"/>
+          </w:tcPr>
+          <w:p>
+            <w:pPr>
+              <w:jc w:val="right"/>
+            </w:pPr>
+            <w:r>
+              <w:t xml:space="preserve">Correct diagnoses wrongly downgraded</w:t>
+            </w:r>
+          </w:p>
+        </w:tc>
+        <w:tc>
+          <w:tcPr>
+            <w:tcW w:w="3120" w:type="dxa"/>
+            <w:shd w:val="clear" w:color="auto" w:fill="F2F2F2"/>
+          </w:tcPr>
+          <w:p>
+            <w:pPr>
+              <w:jc w:val="right"/>
+            </w:pPr>
+            <w:r>
+              <w:t xml:space="preserve">Wrong diagnoses caught</w:t>
+            </w:r>
+          </w:p>
+        </w:tc>
+      </w:tr>
+      <w:tr>
+        <w:tc>
+          <w:tcPr>
+            <w:tcW w:w="3120" w:type="dxa"/>
+          </w:tcPr>
+          <w:p>
+            <w:pPr/>
+            <w:r>
+              <w:t xml:space="preserve">1% (used)</w:t>
+            </w:r>
+          </w:p>
+        </w:tc>
+        <w:tc>
+          <w:tcPr>
+            <w:tcW w:w="3120" w:type="dxa"/>
+          </w:tcPr>
+          <w:p>
+            <w:pPr>
+              <w:jc w:val="right"/>
+            </w:pPr>
+            <w:r>
+              <w:t xml:space="preserve">0 of 237</w:t>
+            </w:r>
+          </w:p>
+        </w:tc>
+        <w:tc>
+          <w:tcPr>
+            <w:tcW w:w="3120" w:type="dxa"/>
+          </w:tcPr>
+          <w:p>
+            <w:pPr>
+              <w:jc w:val="right"/>
+            </w:pPr>
+            <w:r>
+              <w:t xml:space="preserve">1 of 96</w:t>
+            </w:r>
+          </w:p>
+        </w:tc>
+      </w:tr>
+      <w:tr>
+        <w:tc>
+          <w:tcPr>
+            <w:tcW w:w="3120" w:type="dxa"/>
+          </w:tcPr>
+          <w:p>
+            <w:pPr/>
+            <w:r>
+              <w:t xml:space="preserve">2%</w:t>
+            </w:r>
+          </w:p>
+        </w:tc>
+        <w:tc>
+          <w:tcPr>
+            <w:tcW w:w="3120" w:type="dxa"/>
+          </w:tcPr>
+          <w:p>
+            <w:pPr>
+              <w:jc w:val="right"/>
+            </w:pPr>
+            <w:r>
+              <w:t xml:space="preserve">1 of 237</w:t>
+            </w:r>
+          </w:p>
+        </w:tc>
+        <w:tc>
+          <w:tcPr>
+            <w:tcW w:w="3120" w:type="dxa"/>
+          </w:tcPr>
+          <w:p>
+            <w:pPr>
+              <w:jc w:val="right"/>
+            </w:pPr>
+            <w:r>
+              <w:t xml:space="preserve">2 of 96</w:t>
+            </w:r>
+          </w:p>
+        </w:tc>
+      </w:tr>
+      <w:tr>
+        <w:tc>
+          <w:tcPr>
+            <w:tcW w:w="3120" w:type="dxa"/>
+          </w:tcPr>
+          <w:p>
+            <w:pPr/>
+            <w:r>
+              <w:t xml:space="preserve">3%</w:t>
+            </w:r>
+          </w:p>
+        </w:tc>
+        <w:tc>
+          <w:tcPr>
+            <w:tcW w:w="3120" w:type="dxa"/>
+          </w:tcPr>
+          <w:p>
+            <w:pPr>
+              <w:jc w:val="right"/>
+            </w:pPr>
+            <w:r>
+              <w:t xml:space="preserve">6 of 237</w:t>
+            </w:r>
+          </w:p>
+        </w:tc>
+        <w:tc>
+          <w:tcPr>
+            <w:tcW w:w="3120" w:type="dxa"/>
+          </w:tcPr>
+          <w:p>
+            <w:pPr>
+              <w:jc w:val="right"/>
+            </w:pPr>
+            <w:r>
+              <w:t xml:space="preserve">3 of 96</w:t>
+            </w:r>
+          </w:p>
+        </w:tc>
+      </w:tr>
+      <w:tr>
+        <w:tc>
+          <w:tcPr>
+            <w:tcW w:w="3120" w:type="dxa"/>
+          </w:tcPr>
+          <w:p>
+            <w:pPr/>
+            <w:r>
+              <w:t xml:space="preserve">5%</w:t>
+            </w:r>
+          </w:p>
+        </w:tc>
+        <w:tc>
+          <w:tcPr>
+            <w:tcW w:w="3120" w:type="dxa"/>
+          </w:tcPr>
+          <w:p>
+            <w:pPr>
+              <w:jc w:val="right"/>
+            </w:pPr>
+            <w:r>
+              <w:t xml:space="preserve">20 of 237</w:t>
+            </w:r>
+          </w:p>
+        </w:tc>
+        <w:tc>
+          <w:tcPr>
+            <w:tcW w:w="3120" w:type="dxa"/>
+          </w:tcPr>
+          <w:p>
+            <w:pPr>
+              <w:jc w:val="right"/>
+            </w:pPr>
+            <w:r>
+              <w:t xml:space="preserve">7 of 96</w:t>
+            </w:r>
+          </w:p>
+        </w:tc>
+      </w:tr>
+    </w:tbl>
+    <w:p>
+      <w:pPr/>
+      <w:r>
+        <w:t xml:space="preserve">The check rarely fires on in-scope photos, because wrong answers there are mostly confusions between two real diseases with lesions; it exists for photos of conditions outside the 30 classes. Viruses, mites and insect-damage classes are excluded because they do not produce lesions.</w:t>
+      </w:r>
+    </w:p>
+    <w:p>
+      <w:pPr/>
+      <w:r>
+        <w:rPr>
+          <w:b/>
+        </w:rPr>
+        <w:t xml:space="preserve">Insect-damage classes (Experiment D).</w:t>
+      </w:r>
+      <w:r>
+        <w:t xml:space="preserve"> Four pest classes were added to the taxonomy, knowledge base and app, one or two for each cereal crop: maize insect feeding damage (Corn Leaf Infection dataset, about 4,000 field phone photos, mostly fall armyworm), rice hispa (Rice Leafs dataset), and wheat aphids and wheat mites (Aphid and Mite folders of the wheat dataset already in use). Any pest class with fewer than 100 photos is dropped automatically at data preparation. Advice covers integrated pest management only (hand-picking, pheromone traps, natural enemies, neem, leaf-tip clipping, timely irrigation) and never names an insecticide. Pests of tomato, potato and pepper have no dedicated class for lack of field datasets; for those crops the lesion cross-check returns "no disease spots found, may be insect damage". The wheat dataset's validation photos, used for neither training, model selection nor calibration in Experiment D, serve as the first held-out wheat test. Results of the Experiment D ConvNeXt-Tiny (30 classes, calibrated on the same 684 field validation photos): maize insect damage test 100% (223 photos), wheat held-out 90.2% (1,455 photos, incl. aphids and mites), PlantVillage 98.4%, rice 99.7%. On the same 541 field test photos it scores 68.0% against 69.3% for Experiment C (coverage 89.6% vs 90.0%, right when confident 88.4% vs 87.4%), and 73.2% when the farmer names the crop (right when confident 92.1%). Field accuracy is therefore unchanged within noise while four pest classes are gained, so Experiment D replaces C as the deployed model. The fall armyworm photo that started this work is now diagnosed as maize insect feeding damage (67.5%; 94.3% with crop = maize). The offline MobileNetV3 model is still the Experiment C version without pest classes.</w:t>
+      </w:r>
+    </w:p>
+    <w:p>
+      <w:pPr>
+        <w:pStyle w:val="Heading2"/>
+      </w:pPr>
+      <w:r>
+        <w:t xml:space="preserve">8. Severity estimation and explainability</w:t>
+      </w:r>
+    </w:p>
+    <w:p>
+      <w:pPr/>
+      <w:r>
+        <w:t xml:space="preserve">Severity is the share of the leaf covered by lesions, graded 0–4; the lesion model reaches an IoU of 0.63 on 1,247 PlantSeg validation images.</w:t>
+      </w:r>
+    </w:p>
+    <w:p>
+      <w:pPr/>
+      <w:r>
+        <w:rPr>
+          <w:b/>
+        </w:rPr>
+        <w:t xml:space="preserve">Lesion model.</w:t>
+      </w:r>
+      <w:r>
+        <w:t xml:space="preserve"> A U-Net with a ResNet-18 encoder (segmentation-models-pytorch) is trained at 384 px on PlantSeg. Its COCO polygon annotations are rasterised into binary lesion masks, whatever the disease. Loss is binary cross-entropy plus Dice; the best epoch (20) is kept by validation IoU.</w:t>
+      </w:r>
+    </w:p>
+    <w:p>
+      <w:pPr/>
+      <w:r>
+        <w:rPr>
+          <w:b/>
+        </w:rPr>
+        <w:t xml:space="preserve">Leaf area.</w:t>
+      </w:r>
+      <w:r>
+        <w:t xml:space="preserve"> The leaf is found with the Excess-Green index (2G − R − B) and Otsu's threshold, cleaned with a morphological close and open; lesion pixels always count as leaf. If less than 5% of the photo is leaf, the whole photo is used and the result is flagged.</w:t>
+      </w:r>
+    </w:p>
+    <w:p>
+      <w:pPr>
+        <w:pStyle w:val="Code"/>
+      </w:pPr>
+      <w:bookmarkStart w:id="3" w:name="bongo_lang_latex_3"/>
+      <w:bookmarkEnd w:id="3"/>
+      <w:r>
+        <w:t xml:space="preserve">\text{severity} = 100 \times \frac{\text{lesion pixels}}{\text{leaf pixels}}</w:t>
+      </w:r>
+    </w:p>
+    <w:tbl>
+      <w:tblPr>
+        <w:tblStyle w:val="TableGrid"/>
+        <w:tblW w:w="0" w:type="auto"/>
+        <w:tblLayout w:type="fixed"/>
+        <w:tblLook w:val="04A0" w:firstRow="1" w:lastRow="0" w:firstColumn="0" w:lastColumn="0" w:noHBand="0" w:noVBand="1"/>
+      </w:tblPr>
+      <w:tblGrid>
+        <w:gridCol w:w="3120"/>
+        <w:gridCol w:w="3120"/>
+        <w:gridCol w:w="3120"/>
+      </w:tblGrid>
+      <w:tr>
+        <w:trPr>
+          <w:tblHeader/>
+        </w:trPr>
+        <w:tc>
+          <w:tcPr>
+            <w:tcW w:w="3120" w:type="dxa"/>
+            <w:shd w:val="clear" w:color="auto" w:fill="F2F2F2"/>
+          </w:tcPr>
+          <w:p>
             <w:pPr>
               <w:jc w:val="right"/>
             </w:pPr>
@@ -2414,7 +2670,7 @@
         <w:t xml:space="preserve">Knowledge base.</w:t>
       </w:r>
       <w:r>
-        <w:t xml:space="preserve"> All 26 classes have a curated entry: pathogen, description, symptoms, causes, favourable conditions, management steps, organic options, prevention and sources (CIB&amp;RC, TNAU Agritech, ICAR KVK directory). The chemical-control list is deliberately empty until filled from the CIB&amp;RC registration list or ICAR package of practices, because a wrong dose can harm farmers and crops. It is stored in MySQL and synced from a JSON seed on every start.</w:t>
+        <w:t xml:space="preserve"> All 30 classes have a curated entry: pathogen, description, symptoms, causes, favourable conditions, management steps, organic options, prevention and sources (CIB&amp;RC, TNAU Agritech, ICAR KVK directory). The chemical-control list is deliberately empty until filled from the CIB&amp;RC registration list or ICAR package of practices, because a wrong dose can harm farmers and crops. It is stored in MySQL and synced from a JSON seed on every start.</w:t>
       </w:r>
     </w:p>
     <w:p>
@@ -3784,7 +4040,7 @@
     <w:p>
       <w:pPr/>
       <w:r>
-        <w:t xml:space="preserve">A lab-trained classifier that scores 99% can fall to 27% on real field photos, and this project measured that gap rather than reporting the lab number. Adding field photos, balanced sampling and leakage control raised field accuracy to 69.3% across six crops and 26 classes, with lab accuracy unchanged at 98.9%.</w:t>
+        <w:t xml:space="preserve">A lab-trained classifier that scores 99% can fall to 27% on real field photos, and this project measured that gap rather than reporting the lab number. Adding field photos, balanced sampling and leakage control raised field accuracy to 69.3% across six crops and 26 classes, with lab accuracy unchanged at 98.9%; the deployed Experiment D model adds four pest classes at the same field accuracy (68.0%).</w:t>
       </w:r>
     </w:p>
     <w:p>

</xml_diff>

<commit_message>
Hindi advice via local NLLB-200 translation with farming glossary, reviewed corrections and startup pre-translation
</commit_message>
<xml_diff>
--- a/docs/CropCare_AI_Project_Report.docx
+++ b/docs/CropCare_AI_Project_Report.docx
@@ -54,7 +54,7 @@
     <w:p>
       <w:pPr/>
       <w:r>
-        <w:t xml:space="preserve">The application adds lesion-based severity (U-Net, IoU 0.63), Grad-CAM explanations, multi-photo diagnosis, a three-day weather-based disease risk forecast, safety-first treatment advice, Hindi through Bhashini machine translation, and an offline mode. It is built with React, Spring Boot with MySQL, and a FastAPI/PyTorch AI service, and is covered by 37 automated tests and end-to-end browser tests.</w:t>
+        <w:t xml:space="preserve">The application adds lesion-based severity (U-Net, IoU 0.63), Grad-CAM explanations, multi-photo diagnosis, a three-day weather-based disease risk forecast, safety-first treatment advice, Hindi advice translated on the project's own server (NLLB-200 model with a farming glossary and reviewed corrections, no paid API), and an offline mode. It is built with React, Spring Boot with MySQL, and a FastAPI/PyTorch AI service, and is covered by 52 automated tests and end-to-end browser tests.</w:t>
       </w:r>
     </w:p>
     <w:p>
@@ -811,7 +811,7 @@
     <w:p>
       <w:pPr/>
       <w:r>
-        <w:t xml:space="preserve">The browser talks only to the Spring Boot backend, which owns all data and calls the AI service, Open-Meteo and Bhashini; the AI service only classifies.</w:t>
+        <w:t xml:space="preserve">The browser talks only to the Spring Boot backend, which owns all data and calls the AI service and Open-Meteo; the AI service classifies and translates advice into Hindi.</w:t>
       </w:r>
     </w:p>
     <w:p>
@@ -2751,7 +2751,7 @@
         <w:t xml:space="preserve">Hindi.</w:t>
       </w:r>
       <w:r>
-        <w:t xml:space="preserve"> The interface is fully translated, with reviewed Hindi names for all 18 diseases (for example पछेती झुलसा for late blight and पीला रतुआ for yellow rust). Advice and library text are machine-translated by Bhashini, the Government of India language platform: the backend calls its pipeline API, caches each translated sentence in MySQL so it is translated only once, and falls back to English with a notice if Bhashini is unavailable. Translated text is labelled as machine translation.</w:t>
+        <w:t xml:space="preserve"> The interface is fully translated, with reviewed Hindi names for all 30 classes (for example पछेती झुलसा for late blight and पीला रतुआ for yellow rust). Advice and library text are translated by the AI service itself, with Meta's open NLLB-200 model (distilled, 600M parameters) running on the project's own machine, so no account, API key or per-request cost is needed. A general model gets farming words badly wrong (it turned "whorl" into "horse rider", "caterpillars" into "vultures" and "grubs" into "pigs"), so three safeguards were added after translating the whole knowledge base and reading every line: a glossary of about 90 farming terms put in before translation (गोभ, इल्ली, फफूंदनाशक, ठूंठ), reviewed Hindi for 149 sentences the model got wrong, used instead of the model, and translation one sentence at a time, because the model dropped sentences from longer texts. The backend caches each translated sentence in MySQL, pre-translates the whole library at startup (about 4 minutes on a laptop CPU), and falls back to English with a notice if translation is unavailable. Bhashini, the Government of India platform, is supported as an optional alternative when its keys are configured. Translated text is labelled as machine translation.</w:t>
       </w:r>
     </w:p>
     <w:p>
@@ -2886,7 +2886,7 @@
           <w:p>
             <w:pPr/>
             <w:r>
-              <w:t xml:space="preserve">Accounts, image storage, predictions, disease library, advice, weather risk, Bhashini translation and cache, feedback</w:t>
+              <w:t xml:space="preserve">Accounts, image storage, predictions, disease library, advice, weather risk, Hindi translation cache and startup pre-translation, feedback</w:t>
             </w:r>
           </w:p>
         </w:tc>
@@ -2983,7 +2983,7 @@
         <w:t xml:space="preserve">Security.</w:t>
       </w:r>
       <w:r>
-        <w:t xml:space="preserve"> Passwords are hashed with BCrypt; sessions use signed JWTs; reset tokens are stored as SHA-256 hashes with 15-minute expiry. Uploads are checked by file signature (JPEG, PNG, WEBP), not by name, and stored under random names; users can read only their own predictions and photos. The Bhashini key stays on the server.</w:t>
+        <w:t xml:space="preserve"> Passwords are hashed with BCrypt; sessions use signed JWTs; reset tokens are stored as SHA-256 hashes with 15-minute expiry. Uploads are checked by file signature (JPEG, PNG, WEBP), not by name, and stored under random names; users can read only their own predictions and photos. Advice is translated on the project's own server, so no farmer data is sent to an outside translation service.</w:t>
       </w:r>
     </w:p>
     <w:p>
@@ -3243,7 +3243,7 @@
           <w:p>
             <w:pPr/>
             <w:r>
-              <w:t xml:space="preserve">Bhashini config and compute calls against a fake server in Bhashini's JSON format, sentence cache, English fallback, unsupported languages</w:t>
+              <w:t xml:space="preserve">Local translation through a fake AI service, startup pre-translation, glossary, reviewed sentences and sentence splitting; Bhashini calls against a fake server in its JSON format; sentence cache, English fallback, unsupported languages</w:t>
             </w:r>
           </w:p>
         </w:tc>
@@ -4374,6 +4374,37 @@
         </w:numPr>
       </w:pPr>
       <w:hyperlink r:id="rId21" w:history="1">
+        <w:r>
+          <w:rPr>
+            <w:rStyle w:val="Hyperlink"/>
+          </w:rPr>
+          <w:t xml:space="preserve">NLLB Team, "No Language Left Behind: Scaling Human-Centered Machine Translation"</w:t>
+        </w:r>
+      </w:hyperlink>
+      <w:r>
+        <w:t xml:space="preserve">, Meta AI, 2022; model </w:t>
+      </w:r>
+      <w:hyperlink r:id="rId22" w:history="1">
+        <w:r>
+          <w:rPr>
+            <w:rStyle w:val="Hyperlink"/>
+          </w:rPr>
+          <w:t xml:space="preserve">facebook/nllb-200-distilled-600M</w:t>
+        </w:r>
+      </w:hyperlink>
+      <w:r>
+        <w:t xml:space="preserve">.</w:t>
+      </w:r>
+    </w:p>
+    <w:p>
+      <w:pPr>
+        <w:pStyle w:val="ListParagraph"/>
+        <w:numPr>
+          <w:ilvl w:val="0"/>
+          <w:numId w:val="9"/>
+        </w:numPr>
+      </w:pPr>
+      <w:hyperlink r:id="rId23" w:history="1">
         <w:r>
           <w:rPr>
             <w:rStyle w:val="Hyperlink"/>

</xml_diff>

<commit_message>
feat: redesign frontend with landing page, AI assistant, custom Select, brand logo, and mobile fixes
- Add complete landing page: hero demo, how-it-works, explainable AI,
  model stats, project info, FAQ sections with animations
- Add floating AI assistant panel (ChatGPT-style): typing effect,
  read-aloud, copy, speech-to-text, context-aware suggestions
- Replace all native <select> with modern popover/bottom-sheet component
- Add brand logo (extracted emblem) across app: sidebar, auth pages,
  dashboard, assistant avatar, favicon, PWA icons, email headers
- Fix mobile: bottom nav visibility, scan button centered, overflow
  on 17 responsive grids, phone-width safe layouts
- Add 404 page, email verification page, restructured routes
- Backend: Gemini chat with rate limiting, email logo via CID,
  OTP verification, photo metadata on predictions
- Add 120+ i18n keys (English + Hindi) for all new sections
- All 44 backend tests pass, production build verified
</commit_message>
<xml_diff>
--- a/docs/CropCare_AI_Project_Report.docx
+++ b/docs/CropCare_AI_Project_Report.docx
@@ -54,7 +54,7 @@
     <w:p>
       <w:pPr/>
       <w:r>
-        <w:t xml:space="preserve">The application adds lesion-based severity (U-Net, IoU 0.63), Grad-CAM explanations, multi-photo diagnosis, a three-day weather-based disease risk forecast, safety-first treatment advice, Hindi advice translated on the project's own server (NLLB-200 model with a farming glossary and reviewed corrections, no paid API), and an offline mode. It is built with React, Spring Boot with MySQL, and a FastAPI/PyTorch AI service, and is covered by 52 automated tests and end-to-end browser tests.</w:t>
+        <w:t xml:space="preserve">The application adds lesion-based severity (U-Net, IoU 0.63), Grad-CAM explanations, multi-photo diagnosis, a three-day weather-based disease risk forecast, safety-first treatment advice, Hindi advice translated on the project's own server (NLLB-200 model with a farming glossary and reviewed corrections, no paid API), and an offline mode. It is built with React, Spring Boot with MySQL, and a FastAPI/PyTorch AI service, and is covered by 70 automated tests and end-to-end browser tests.</w:t>
       </w:r>
     </w:p>
     <w:p>
@@ -585,7 +585,7 @@
           <w:p>
             <w:pPr/>
             <w:r>
-              <w:t xml:space="preserve">A trained classifier decides; no LLM diagnoses</w:t>
+              <w:t xml:space="preserve">A trained classifier decides; the LLM only answers follow-up questions about that decision</w:t>
             </w:r>
           </w:p>
         </w:tc>
@@ -2755,6 +2755,27 @@
       </w:r>
     </w:p>
     <w:p>
+      <w:pPr/>
+      <w:r>
+        <w:rPr>
+          <w:b/>
+        </w:rPr>
+        <w:t xml:space="preserve">Ask about this result.</w:t>
+      </w:r>
+      <w:r>
+        <w:t xml:space="preserve"> A fifth tab on the result page lets the farmer ask follow-up questions, by tapping one of four suggested questions, typing their own, or speaking it (the browser's built-in speech recognition in Hindi or Indian English; the spoken text appears in the box to check before sending, so a misheard question is never sent on its own), in English or Hindi. Google Gemini (free tier, </w:t>
+      </w:r>
+      <w:r>
+        <w:rPr>
+          <w:rStyle w:val="CodeChar"/>
+        </w:rPr>
+        <w:t xml:space="preserve">gemini-3.5-flash</w:t>
+      </w:r>
+      <w:r>
+        <w:t xml:space="preserve">) writes the answer, but the classifier still makes the diagnosis; the language model only explains it. Answers are kept in bounds in layers, all enforced by the backend: only the scan's owner can ask; questions are limited to 300 characters, 20 a day and 10 per scan; a fixed system instruction gives the model only this scan's diagnosis, the advice already shown and the matching knowledge-base entries, and forbids pesticide names, doses and treatment of an unconfirmed diagnosis; the farmer's text is marked as a question, never as instructions; the model must answer in JSON that says whether the question is in scope, and off-topic questions get a fixed reply; Google's safety filter is on; and a final check replaces any answer that names a pesticide or gives a dose, in English or Hindi. Only text is sent, never photos, and every question and answer is stored for review.</w:t>
+      </w:r>
+    </w:p>
+    <w:p>
       <w:pPr>
         <w:pStyle w:val="Heading2"/>
       </w:pPr>
@@ -2983,7 +3004,7 @@
         <w:t xml:space="preserve">Security.</w:t>
       </w:r>
       <w:r>
-        <w:t xml:space="preserve"> Passwords are hashed with BCrypt; sessions use signed JWTs; reset tokens are stored as SHA-256 hashes with 15-minute expiry. Uploads are checked by file signature (JPEG, PNG, WEBP), not by name, and stored under random names; users can read only their own predictions and photos. Advice is translated on the project's own server, so no farmer data is sent to an outside translation service.</w:t>
+        <w:t xml:space="preserve"> Passwords are hashed with BCrypt; new accounts must verify their email with a 6-digit code (valid 10 minutes, 5 wrong tries, a new code at most once a minute, stored only as an HMAC with the server secret) before they receive a login token; sessions use signed JWTs; reset tokens are stored as SHA-256 hashes with 15-minute expiry. Uploads are checked by file signature (JPEG, PNG, WEBP), not by name, and stored under random names; users can read only their own predictions and photos. Advice is translated on the project's own server, so no farmer data is sent to an outside translation service.</w:t>
       </w:r>
     </w:p>
     <w:p>

</xml_diff>